<commit_message>
Model Card for the part on frugal AI
</commit_message>
<xml_diff>
--- a/MODEL CARD.docx
+++ b/MODEL CARD.docx
@@ -139,15 +139,48 @@
           <w:numId w:val="14"/>
         </w:numPr>
       </w:pPr>
+      <w:proofErr w:type="spellStart"/>
       <w:r>
         <w:rPr>
           <w:b/>
           <w:bCs/>
         </w:rPr>
-        <w:t>Dataset(s) utilisés :</w:t>
-      </w:r>
-      <w:r>
-        <w:t xml:space="preserve"> Jeu de données RH "Human Resources Data Set" (inspiré de Rich Huebner sur Kaggle), conçu par les Drs Rich Huebner et Carla Patalano.</w:t>
+        <w:t>Dataset</w:t>
+      </w:r>
+      <w:proofErr w:type="spellEnd"/>
+      <w:r>
+        <w:rPr>
+          <w:b/>
+          <w:bCs/>
+        </w:rPr>
+        <w:t>(s) utilisés :</w:t>
+      </w:r>
+      <w:r>
+        <w:t xml:space="preserve"> Jeu de données RH "Human </w:t>
+      </w:r>
+      <w:proofErr w:type="spellStart"/>
+      <w:r>
+        <w:t>Resources</w:t>
+      </w:r>
+      <w:proofErr w:type="spellEnd"/>
+      <w:r>
+        <w:t xml:space="preserve"> Data Set" (inspiré de Rich Huebner sur </w:t>
+      </w:r>
+      <w:proofErr w:type="spellStart"/>
+      <w:r>
+        <w:t>Kaggle</w:t>
+      </w:r>
+      <w:proofErr w:type="spellEnd"/>
+      <w:r>
+        <w:t xml:space="preserve">), conçu par les </w:t>
+      </w:r>
+      <w:proofErr w:type="spellStart"/>
+      <w:r>
+        <w:t>Drs</w:t>
+      </w:r>
+      <w:proofErr w:type="spellEnd"/>
+      <w:r>
+        <w:t xml:space="preserve"> Rich Huebner et Carla Patalano.</w:t>
       </w:r>
     </w:p>
     <w:p>
@@ -217,7 +250,23 @@
         <w:t>Diversité :</w:t>
       </w:r>
       <w:r>
-        <w:t xml:space="preserve"> Données synthétiques représentant divers départements, niveaux de salaire, âges, sexes (Sex = M/F) et ethnies (RaceDesc).</w:t>
+        <w:t xml:space="preserve"> Données synthétiques représentant divers départements, niveaux de salaire, âges, sexes (</w:t>
+      </w:r>
+      <w:proofErr w:type="spellStart"/>
+      <w:r>
+        <w:t>Sex</w:t>
+      </w:r>
+      <w:proofErr w:type="spellEnd"/>
+      <w:r>
+        <w:t xml:space="preserve"> = M/F) et ethnies (</w:t>
+      </w:r>
+      <w:proofErr w:type="spellStart"/>
+      <w:r>
+        <w:t>RaceDesc</w:t>
+      </w:r>
+      <w:proofErr w:type="spellEnd"/>
+      <w:r>
+        <w:t>).</w:t>
       </w:r>
     </w:p>
     <w:p>
@@ -241,6 +290,11 @@
     </w:p>
     <w:p>
       <w:pPr>
+        <w:pStyle w:val="Paragraphedeliste"/>
+      </w:pPr>
+    </w:p>
+    <w:p>
+      <w:pPr>
         <w:rPr>
           <w:b/>
           <w:bCs/>
@@ -258,40 +312,139 @@
       <w:pPr>
         <w:numPr>
           <w:ilvl w:val="0"/>
-          <w:numId w:val="3"/>
+          <w:numId w:val="18"/>
         </w:numPr>
       </w:pPr>
       <w:r>
-        <w:t>Métriques utilisées (accuracy, F1, BLEU…) :</w:t>
+        <w:rPr>
+          <w:b/>
+          <w:bCs/>
+        </w:rPr>
+        <w:t>Métriques utilisées :</w:t>
+      </w:r>
+      <w:r>
+        <w:t xml:space="preserve"> </w:t>
+      </w:r>
+      <w:proofErr w:type="spellStart"/>
+      <w:r>
+        <w:rPr>
+          <w:b/>
+          <w:bCs/>
+        </w:rPr>
+        <w:t>Accuracy</w:t>
+      </w:r>
+      <w:proofErr w:type="spellEnd"/>
+      <w:r>
+        <w:rPr>
+          <w:b/>
+          <w:bCs/>
+        </w:rPr>
+        <w:t xml:space="preserve"> (Précision globale)</w:t>
+      </w:r>
+      <w:r>
+        <w:t xml:space="preserve"> : Pour voir si le modèle a souvent raison.</w:t>
       </w:r>
     </w:p>
     <w:p>
       <w:pPr>
         <w:numPr>
-          <w:ilvl w:val="0"/>
-          <w:numId w:val="3"/>
+          <w:ilvl w:val="1"/>
+          <w:numId w:val="18"/>
         </w:numPr>
       </w:pPr>
       <w:r>
-        <w:t>Résultats :</w:t>
-      </w:r>
-      <w:r>
-        <w:t xml:space="preserve"> </w:t>
-      </w:r>
-      <w:r>
-        <w:t>(résultats globaux + éventuellement par sous</w:t>
-      </w:r>
-      <w:r>
-        <w:noBreakHyphen/>
-        <w:t>groupe pour l’équité)</w:t>
+        <w:rPr>
+          <w:b/>
+          <w:bCs/>
+        </w:rPr>
+        <w:t>F1-Score</w:t>
+      </w:r>
+      <w:r>
+        <w:t xml:space="preserve"> : Métrique privilégiée ici car notre </w:t>
+      </w:r>
+      <w:proofErr w:type="spellStart"/>
+      <w:r>
+        <w:t>dataset</w:t>
+      </w:r>
+      <w:proofErr w:type="spellEnd"/>
+      <w:r>
+        <w:t xml:space="preserve"> est déséquilibré (plus d'employés qui restent que de départs).</w:t>
       </w:r>
     </w:p>
     <w:p>
       <w:pPr>
+        <w:numPr>
+          <w:ilvl w:val="1"/>
+          <w:numId w:val="18"/>
+        </w:numPr>
+      </w:pPr>
+      <w:r>
+        <w:rPr>
+          <w:b/>
+          <w:bCs/>
+        </w:rPr>
+        <w:t>AUC (ROC)</w:t>
+      </w:r>
+      <w:r>
+        <w:t xml:space="preserve"> : Pour évaluer la capacité du modèle à bien séparer les deux classes.</w:t>
+      </w:r>
+    </w:p>
+    <w:p>
+      <w:pPr>
+        <w:numPr>
+          <w:ilvl w:val="0"/>
+          <w:numId w:val="18"/>
+        </w:numPr>
+      </w:pPr>
+      <w:r>
+        <w:rPr>
+          <w:b/>
+          <w:bCs/>
+        </w:rPr>
+        <w:t>Résultats du Modèle Frugal (Régression Logistique) :</w:t>
+      </w:r>
+    </w:p>
+    <w:p>
+      <w:pPr>
         <w:ind w:left="720"/>
       </w:pPr>
       <w:r>
-        <w:t xml:space="preserve"> </w:t>
+        <w:lastRenderedPageBreak/>
+        <w:drawing>
+          <wp:inline distT="0" distB="0" distL="0" distR="0" wp14:anchorId="3DF07594" wp14:editId="4CDB8AED">
+            <wp:extent cx="4261069" cy="1822544"/>
+            <wp:effectExtent l="0" t="0" r="6350" b="6350"/>
+            <wp:docPr id="884460909" name="Image 1"/>
+            <wp:cNvGraphicFramePr>
+              <a:graphicFrameLocks xmlns:a="http://schemas.openxmlformats.org/drawingml/2006/main" noChangeAspect="1"/>
+            </wp:cNvGraphicFramePr>
+            <a:graphic xmlns:a="http://schemas.openxmlformats.org/drawingml/2006/main">
+              <a:graphicData uri="http://schemas.openxmlformats.org/drawingml/2006/picture">
+                <pic:pic xmlns:pic="http://schemas.openxmlformats.org/drawingml/2006/picture">
+                  <pic:nvPicPr>
+                    <pic:cNvPr id="884460909" name=""/>
+                    <pic:cNvPicPr/>
+                  </pic:nvPicPr>
+                  <pic:blipFill>
+                    <a:blip r:embed="rId5"/>
+                    <a:stretch>
+                      <a:fillRect/>
+                    </a:stretch>
+                  </pic:blipFill>
+                  <pic:spPr>
+                    <a:xfrm>
+                      <a:off x="0" y="0"/>
+                      <a:ext cx="4261069" cy="1822544"/>
+                    </a:xfrm>
+                    <a:prstGeom prst="rect">
+                      <a:avLst/>
+                    </a:prstGeom>
+                  </pic:spPr>
+                </pic:pic>
+              </a:graphicData>
+            </a:graphic>
+          </wp:inline>
+        </w:drawing>
       </w:r>
     </w:p>
     <w:p>
@@ -325,7 +478,21 @@
         <w:t>Risques d’erreur connus :</w:t>
       </w:r>
       <w:r>
-        <w:t xml:space="preserve"> Risque de surapprentissage (overfitting). Ayant conservé la totalité des 36 variables pour seulement 311 lignes, le modèle pourrait avoir mémorisé les données plutôt que d'avoir appris des règles générales.</w:t>
+        <w:t xml:space="preserve"> Risque de surapprentissage (</w:t>
+      </w:r>
+      <w:proofErr w:type="spellStart"/>
+      <w:r>
+        <w:t>overfitting</w:t>
+      </w:r>
+      <w:proofErr w:type="spellEnd"/>
+      <w:r>
+        <w:t xml:space="preserve">). Ayant conservé </w:t>
+      </w:r>
+      <w:r>
+        <w:t xml:space="preserve">une grande quantité de </w:t>
+      </w:r>
+      <w:r>
+        <w:t>variables pour seulement 311 lignes, le modèle pourrait avoir mémorisé les données plutôt que d'avoir appris des règles générales.</w:t>
       </w:r>
     </w:p>
     <w:p>
@@ -344,7 +511,15 @@
         <w:t>Situations non couvertes :</w:t>
       </w:r>
       <w:r>
-        <w:t xml:space="preserve"> Le modèle ne peut pas prédire les départs liés à des facteurs externes non mesurés dans le dataset (crise économique, changement inattendu de direction, etc.).</w:t>
+        <w:t xml:space="preserve"> Le modèle ne peut pas prédire les départs liés à des facteurs externes non mesurés dans le </w:t>
+      </w:r>
+      <w:proofErr w:type="spellStart"/>
+      <w:r>
+        <w:t>dataset</w:t>
+      </w:r>
+      <w:proofErr w:type="spellEnd"/>
+      <w:r>
+        <w:t xml:space="preserve"> (crise économique, changement inattendu de direction, etc.).</w:t>
       </w:r>
     </w:p>
     <w:p>
@@ -360,7 +535,6 @@
           <w:b/>
           <w:bCs/>
         </w:rPr>
-        <w:lastRenderedPageBreak/>
         <w:t>Risques de biais :</w:t>
       </w:r>
       <w:r>
@@ -403,7 +577,15 @@
         <w:t>Risques de mauvaise utilisation :</w:t>
       </w:r>
       <w:r>
-        <w:t xml:space="preserve"> Une confiance aveugle de la direction RH envers le dashboard. Le risque est que les RH prennent des décisions préventives injustes (ex: refuser une promotion à un employé parce que l'IA prédit qu'il va démissionner).</w:t>
+        <w:t xml:space="preserve"> Une confiance aveugle de la direction RH envers le </w:t>
+      </w:r>
+      <w:proofErr w:type="spellStart"/>
+      <w:r>
+        <w:t>dashboard</w:t>
+      </w:r>
+      <w:proofErr w:type="spellEnd"/>
+      <w:r>
+        <w:t>. Le risque est que les RH prennent des décisions préventives injustes (ex: refuser une promotion à un employé parce que l'IA prédit qu'il va démissionner).</w:t>
       </w:r>
     </w:p>
     <w:p>
@@ -422,7 +604,15 @@
         <w:t>Contrôles mis en place :</w:t>
       </w:r>
       <w:r>
-        <w:t xml:space="preserve"> Le dashboard est un outil d'aide à la décision, les RH gardent le jugement final.</w:t>
+        <w:t xml:space="preserve"> Le </w:t>
+      </w:r>
+      <w:proofErr w:type="spellStart"/>
+      <w:r>
+        <w:t>dashboard</w:t>
+      </w:r>
+      <w:proofErr w:type="spellEnd"/>
+      <w:r>
+        <w:t xml:space="preserve"> est un outil d'aide à la décision, les RH gardent le jugement final.</w:t>
       </w:r>
       <w:r>
         <w:t xml:space="preserve"> Donc, avant de pouvoir prendre une action concrète qui ne serait pas positive pour l’employé, le RH doit </w:t>
@@ -453,51 +643,145 @@
       <w:pPr>
         <w:numPr>
           <w:ilvl w:val="0"/>
-          <w:numId w:val="6"/>
+          <w:numId w:val="19"/>
         </w:numPr>
       </w:pPr>
       <w:r>
-        <w:t>Poids du modèle :</w:t>
-      </w:r>
-      <w:r>
-        <w:t xml:space="preserve"> </w:t>
-      </w:r>
-      <w:r>
-        <w:t>(en Mo ou Go)</w:t>
+        <w:t xml:space="preserve">Choix architectural basé sur la donnée : Nous avons </w:t>
+      </w:r>
+      <w:proofErr w:type="spellStart"/>
+      <w:r>
+        <w:t>benchmarké</w:t>
+      </w:r>
+      <w:proofErr w:type="spellEnd"/>
+      <w:r>
+        <w:t xml:space="preserve"> plusieurs modèles. Notre intuition initiale suggérait que le modèle le plus simple mathématiquement (Régression Logistique) serait le plus frugal. Cependant, la mesure réelle a prouvé le contraire.</w:t>
       </w:r>
     </w:p>
     <w:p>
       <w:pPr>
         <w:numPr>
           <w:ilvl w:val="0"/>
-          <w:numId w:val="6"/>
+          <w:numId w:val="19"/>
         </w:numPr>
       </w:pPr>
       <w:r>
-        <w:t>Temps d’inférence :</w:t>
-      </w:r>
-      <w:r>
-        <w:t xml:space="preserve"> </w:t>
-      </w:r>
-      <w:r>
-        <w:t>(sur CPU/GPU)</w:t>
+        <w:lastRenderedPageBreak/>
+        <w:t>Énergie estimée (</w:t>
+      </w:r>
+      <w:proofErr w:type="spellStart"/>
+      <w:r>
+        <w:t>CodeCarbon</w:t>
+      </w:r>
+      <w:proofErr w:type="spellEnd"/>
+      <w:r>
+        <w:t xml:space="preserve">) : Nous avons instrumenté notre code avec </w:t>
+      </w:r>
+      <w:proofErr w:type="spellStart"/>
+      <w:r>
+        <w:t>CodeCarbon</w:t>
+      </w:r>
+      <w:proofErr w:type="spellEnd"/>
+      <w:r>
+        <w:t>. La Régression Logistique a consommé 0.000009 kWh (due au temps de convergence du solveur). En revanche, le Random Forest n'a consommé que 0.000004 kWh.</w:t>
       </w:r>
     </w:p>
     <w:p>
       <w:pPr>
         <w:numPr>
           <w:ilvl w:val="0"/>
-          <w:numId w:val="6"/>
+          <w:numId w:val="19"/>
         </w:numPr>
       </w:pPr>
       <w:r>
-        <w:t>Énergie estimée (CodeCarbon) :</w:t>
-      </w:r>
-      <w:r>
-        <w:t xml:space="preserve"> </w:t>
-      </w:r>
-      <w:r>
-        <w:t>(ex : CodeCarbon, approximation kWh/CO₂)</w:t>
+        <w:t xml:space="preserve">Poids du modèle : Environ 150 à 200 Ko (Modèle Random Forest </w:t>
+      </w:r>
+      <w:proofErr w:type="spellStart"/>
+      <w:r>
+        <w:t>Scikit</w:t>
+      </w:r>
+      <w:proofErr w:type="spellEnd"/>
+      <w:r>
+        <w:t>-Learn), ce qui reste infime par rapport aux modèles Deep Learning.</w:t>
+      </w:r>
+    </w:p>
+    <w:p>
+      <w:pPr>
+        <w:numPr>
+          <w:ilvl w:val="0"/>
+          <w:numId w:val="19"/>
+        </w:numPr>
+      </w:pPr>
+      <w:r>
+        <w:t>Temps d'inférence : Moins de 2 millisecondes sur un CPU classique (Intel Xeon 2.20GHz).</w:t>
+      </w:r>
+    </w:p>
+    <w:p>
+      <w:pPr>
+        <w:numPr>
+          <w:ilvl w:val="0"/>
+          <w:numId w:val="19"/>
+        </w:numPr>
+      </w:pPr>
+      <w:r>
+        <w:t xml:space="preserve">Conclusion Frugale : En nous basant sur les métriques réelles de </w:t>
+      </w:r>
+      <w:proofErr w:type="spellStart"/>
+      <w:r>
+        <w:t>CodeCarbon</w:t>
+      </w:r>
+      <w:proofErr w:type="spellEnd"/>
+      <w:r>
+        <w:t>, nous avons déployé le Random Forest : il offre non seulement les meilleures performances (F1-score), mais divise aussi par deux l'empreinte carbone matérielle par rapport à la régression logistique sur ce jeu de données.</w:t>
+      </w:r>
+    </w:p>
+    <w:p>
+      <w:pPr>
+        <w:rPr>
+          <w:b/>
+          <w:bCs/>
+        </w:rPr>
+      </w:pPr>
+      <w:r>
+        <w:rPr>
+          <w:b/>
+          <w:bCs/>
+        </w:rPr>
+        <w:drawing>
+          <wp:inline distT="0" distB="0" distL="0" distR="0" wp14:anchorId="2DB64BCB" wp14:editId="4586724D">
+            <wp:extent cx="5410478" cy="1498677"/>
+            <wp:effectExtent l="0" t="0" r="0" b="6350"/>
+            <wp:docPr id="1050251176" name="Image 1"/>
+            <wp:cNvGraphicFramePr>
+              <a:graphicFrameLocks xmlns:a="http://schemas.openxmlformats.org/drawingml/2006/main" noChangeAspect="1"/>
+            </wp:cNvGraphicFramePr>
+            <a:graphic xmlns:a="http://schemas.openxmlformats.org/drawingml/2006/main">
+              <a:graphicData uri="http://schemas.openxmlformats.org/drawingml/2006/picture">
+                <pic:pic xmlns:pic="http://schemas.openxmlformats.org/drawingml/2006/picture">
+                  <pic:nvPicPr>
+                    <pic:cNvPr id="1050251176" name=""/>
+                    <pic:cNvPicPr/>
+                  </pic:nvPicPr>
+                  <pic:blipFill>
+                    <a:blip r:embed="rId6"/>
+                    <a:stretch>
+                      <a:fillRect/>
+                    </a:stretch>
+                  </pic:blipFill>
+                  <pic:spPr>
+                    <a:xfrm>
+                      <a:off x="0" y="0"/>
+                      <a:ext cx="5410478" cy="1498677"/>
+                    </a:xfrm>
+                    <a:prstGeom prst="rect">
+                      <a:avLst/>
+                    </a:prstGeom>
+                  </pic:spPr>
+                </pic:pic>
+              </a:graphicData>
+            </a:graphic>
+          </wp:inline>
+        </w:drawing>
       </w:r>
     </w:p>
     <w:p>
@@ -546,7 +830,31 @@
         <w:t xml:space="preserve"> </w:t>
       </w:r>
       <w:r>
-        <w:t>Les noms, et emails des employés ont été supprimé du dataset sur lequel on a entrainé le modèle de machine learning. De plus, pour éviter qu’un employé puisse être retrouvé en cas de vol de la base de donné, les Id d’employé ont été hacher et seul le DRH possède un excel contenant les id originaux avec les noms et emails.</w:t>
+        <w:t xml:space="preserve">Les noms, et emails des employés ont été supprimé du </w:t>
+      </w:r>
+      <w:proofErr w:type="spellStart"/>
+      <w:r>
+        <w:t>dataset</w:t>
+      </w:r>
+      <w:proofErr w:type="spellEnd"/>
+      <w:r>
+        <w:t xml:space="preserve"> sur lequel on a entrainé le modèle de machine </w:t>
+      </w:r>
+      <w:proofErr w:type="spellStart"/>
+      <w:r>
+        <w:t>learning</w:t>
+      </w:r>
+      <w:proofErr w:type="spellEnd"/>
+      <w:r>
+        <w:t xml:space="preserve">. De plus, pour éviter qu’un employé puisse être retrouvé en cas de vol de la base de donné, les Id d’employé ont été hacher et seul le DRH possède un </w:t>
+      </w:r>
+      <w:proofErr w:type="spellStart"/>
+      <w:r>
+        <w:t>excel</w:t>
+      </w:r>
+      <w:proofErr w:type="spellEnd"/>
+      <w:r>
+        <w:t xml:space="preserve"> contenant les id originaux avec les noms et emails.</w:t>
       </w:r>
     </w:p>
     <w:p>
@@ -681,6 +989,155 @@
     </w:lvl>
   </w:abstractNum>
   <w:abstractNum w:abstractNumId="1" w15:restartNumberingAfterBreak="0">
+    <w:nsid w:val="07D40A68"/>
+    <w:multiLevelType w:val="multilevel"/>
+    <w:tmpl w:val="CE7613EE"/>
+    <w:lvl w:ilvl="0">
+      <w:start w:val="1"/>
+      <w:numFmt w:val="bullet"/>
+      <w:lvlText w:val=""/>
+      <w:lvlJc w:val="left"/>
+      <w:pPr>
+        <w:tabs>
+          <w:tab w:val="num" w:pos="720"/>
+        </w:tabs>
+        <w:ind w:left="720" w:hanging="360"/>
+      </w:pPr>
+      <w:rPr>
+        <w:rFonts w:ascii="Symbol" w:hAnsi="Symbol" w:hint="default"/>
+        <w:sz w:val="20"/>
+      </w:rPr>
+    </w:lvl>
+    <w:lvl w:ilvl="1">
+      <w:start w:val="1"/>
+      <w:numFmt w:val="bullet"/>
+      <w:lvlText w:val="o"/>
+      <w:lvlJc w:val="left"/>
+      <w:pPr>
+        <w:tabs>
+          <w:tab w:val="num" w:pos="1440"/>
+        </w:tabs>
+        <w:ind w:left="1440" w:hanging="360"/>
+      </w:pPr>
+      <w:rPr>
+        <w:rFonts w:ascii="Courier New" w:hAnsi="Courier New" w:hint="default"/>
+        <w:sz w:val="20"/>
+      </w:rPr>
+    </w:lvl>
+    <w:lvl w:ilvl="2" w:tentative="1">
+      <w:start w:val="1"/>
+      <w:numFmt w:val="bullet"/>
+      <w:lvlText w:val=""/>
+      <w:lvlJc w:val="left"/>
+      <w:pPr>
+        <w:tabs>
+          <w:tab w:val="num" w:pos="2160"/>
+        </w:tabs>
+        <w:ind w:left="2160" w:hanging="360"/>
+      </w:pPr>
+      <w:rPr>
+        <w:rFonts w:ascii="Wingdings" w:hAnsi="Wingdings" w:hint="default"/>
+        <w:sz w:val="20"/>
+      </w:rPr>
+    </w:lvl>
+    <w:lvl w:ilvl="3" w:tentative="1">
+      <w:start w:val="1"/>
+      <w:numFmt w:val="bullet"/>
+      <w:lvlText w:val=""/>
+      <w:lvlJc w:val="left"/>
+      <w:pPr>
+        <w:tabs>
+          <w:tab w:val="num" w:pos="2880"/>
+        </w:tabs>
+        <w:ind w:left="2880" w:hanging="360"/>
+      </w:pPr>
+      <w:rPr>
+        <w:rFonts w:ascii="Wingdings" w:hAnsi="Wingdings" w:hint="default"/>
+        <w:sz w:val="20"/>
+      </w:rPr>
+    </w:lvl>
+    <w:lvl w:ilvl="4" w:tentative="1">
+      <w:start w:val="1"/>
+      <w:numFmt w:val="bullet"/>
+      <w:lvlText w:val=""/>
+      <w:lvlJc w:val="left"/>
+      <w:pPr>
+        <w:tabs>
+          <w:tab w:val="num" w:pos="3600"/>
+        </w:tabs>
+        <w:ind w:left="3600" w:hanging="360"/>
+      </w:pPr>
+      <w:rPr>
+        <w:rFonts w:ascii="Wingdings" w:hAnsi="Wingdings" w:hint="default"/>
+        <w:sz w:val="20"/>
+      </w:rPr>
+    </w:lvl>
+    <w:lvl w:ilvl="5" w:tentative="1">
+      <w:start w:val="1"/>
+      <w:numFmt w:val="bullet"/>
+      <w:lvlText w:val=""/>
+      <w:lvlJc w:val="left"/>
+      <w:pPr>
+        <w:tabs>
+          <w:tab w:val="num" w:pos="4320"/>
+        </w:tabs>
+        <w:ind w:left="4320" w:hanging="360"/>
+      </w:pPr>
+      <w:rPr>
+        <w:rFonts w:ascii="Wingdings" w:hAnsi="Wingdings" w:hint="default"/>
+        <w:sz w:val="20"/>
+      </w:rPr>
+    </w:lvl>
+    <w:lvl w:ilvl="6" w:tentative="1">
+      <w:start w:val="1"/>
+      <w:numFmt w:val="bullet"/>
+      <w:lvlText w:val=""/>
+      <w:lvlJc w:val="left"/>
+      <w:pPr>
+        <w:tabs>
+          <w:tab w:val="num" w:pos="5040"/>
+        </w:tabs>
+        <w:ind w:left="5040" w:hanging="360"/>
+      </w:pPr>
+      <w:rPr>
+        <w:rFonts w:ascii="Wingdings" w:hAnsi="Wingdings" w:hint="default"/>
+        <w:sz w:val="20"/>
+      </w:rPr>
+    </w:lvl>
+    <w:lvl w:ilvl="7" w:tentative="1">
+      <w:start w:val="1"/>
+      <w:numFmt w:val="bullet"/>
+      <w:lvlText w:val=""/>
+      <w:lvlJc w:val="left"/>
+      <w:pPr>
+        <w:tabs>
+          <w:tab w:val="num" w:pos="5760"/>
+        </w:tabs>
+        <w:ind w:left="5760" w:hanging="360"/>
+      </w:pPr>
+      <w:rPr>
+        <w:rFonts w:ascii="Wingdings" w:hAnsi="Wingdings" w:hint="default"/>
+        <w:sz w:val="20"/>
+      </w:rPr>
+    </w:lvl>
+    <w:lvl w:ilvl="8" w:tentative="1">
+      <w:start w:val="1"/>
+      <w:numFmt w:val="bullet"/>
+      <w:lvlText w:val=""/>
+      <w:lvlJc w:val="left"/>
+      <w:pPr>
+        <w:tabs>
+          <w:tab w:val="num" w:pos="6480"/>
+        </w:tabs>
+        <w:ind w:left="6480" w:hanging="360"/>
+      </w:pPr>
+      <w:rPr>
+        <w:rFonts w:ascii="Wingdings" w:hAnsi="Wingdings" w:hint="default"/>
+        <w:sz w:val="20"/>
+      </w:rPr>
+    </w:lvl>
+  </w:abstractNum>
+  <w:abstractNum w:abstractNumId="2" w15:restartNumberingAfterBreak="0">
     <w:nsid w:val="16B13945"/>
     <w:multiLevelType w:val="multilevel"/>
     <w:tmpl w:val="7AD6D3CE"/>
@@ -829,7 +1286,7 @@
       </w:rPr>
     </w:lvl>
   </w:abstractNum>
-  <w:abstractNum w:abstractNumId="2" w15:restartNumberingAfterBreak="0">
+  <w:abstractNum w:abstractNumId="3" w15:restartNumberingAfterBreak="0">
     <w:nsid w:val="1B873673"/>
     <w:multiLevelType w:val="hybridMultilevel"/>
     <w:tmpl w:val="57D01986"/>
@@ -942,7 +1399,7 @@
       </w:rPr>
     </w:lvl>
   </w:abstractNum>
-  <w:abstractNum w:abstractNumId="3" w15:restartNumberingAfterBreak="0">
+  <w:abstractNum w:abstractNumId="4" w15:restartNumberingAfterBreak="0">
     <w:nsid w:val="20285005"/>
     <w:multiLevelType w:val="multilevel"/>
     <w:tmpl w:val="3EC45574"/>
@@ -1091,7 +1548,7 @@
       </w:rPr>
     </w:lvl>
   </w:abstractNum>
-  <w:abstractNum w:abstractNumId="4" w15:restartNumberingAfterBreak="0">
+  <w:abstractNum w:abstractNumId="5" w15:restartNumberingAfterBreak="0">
     <w:nsid w:val="2D304602"/>
     <w:multiLevelType w:val="hybridMultilevel"/>
     <w:tmpl w:val="EE3C22DC"/>
@@ -1204,7 +1661,7 @@
       </w:rPr>
     </w:lvl>
   </w:abstractNum>
-  <w:abstractNum w:abstractNumId="5" w15:restartNumberingAfterBreak="0">
+  <w:abstractNum w:abstractNumId="6" w15:restartNumberingAfterBreak="0">
     <w:nsid w:val="334760CA"/>
     <w:multiLevelType w:val="multilevel"/>
     <w:tmpl w:val="553416B8"/>
@@ -1353,7 +1810,7 @@
       </w:rPr>
     </w:lvl>
   </w:abstractNum>
-  <w:abstractNum w:abstractNumId="6" w15:restartNumberingAfterBreak="0">
+  <w:abstractNum w:abstractNumId="7" w15:restartNumberingAfterBreak="0">
     <w:nsid w:val="3F7F3A8D"/>
     <w:multiLevelType w:val="hybridMultilevel"/>
     <w:tmpl w:val="D0AE53E4"/>
@@ -1466,7 +1923,7 @@
       </w:rPr>
     </w:lvl>
   </w:abstractNum>
-  <w:abstractNum w:abstractNumId="7" w15:restartNumberingAfterBreak="0">
+  <w:abstractNum w:abstractNumId="8" w15:restartNumberingAfterBreak="0">
     <w:nsid w:val="3FDD464A"/>
     <w:multiLevelType w:val="multilevel"/>
     <w:tmpl w:val="AC2A6F6C"/>
@@ -1615,7 +2072,7 @@
       </w:rPr>
     </w:lvl>
   </w:abstractNum>
-  <w:abstractNum w:abstractNumId="8" w15:restartNumberingAfterBreak="0">
+  <w:abstractNum w:abstractNumId="9" w15:restartNumberingAfterBreak="0">
     <w:nsid w:val="4B680F19"/>
     <w:multiLevelType w:val="multilevel"/>
     <w:tmpl w:val="EAB4BC7A"/>
@@ -1764,7 +2221,7 @@
       </w:rPr>
     </w:lvl>
   </w:abstractNum>
-  <w:abstractNum w:abstractNumId="9" w15:restartNumberingAfterBreak="0">
+  <w:abstractNum w:abstractNumId="10" w15:restartNumberingAfterBreak="0">
     <w:nsid w:val="4E875B85"/>
     <w:multiLevelType w:val="multilevel"/>
     <w:tmpl w:val="387A1DCA"/>
@@ -1913,7 +2370,7 @@
       </w:rPr>
     </w:lvl>
   </w:abstractNum>
-  <w:abstractNum w:abstractNumId="10" w15:restartNumberingAfterBreak="0">
+  <w:abstractNum w:abstractNumId="11" w15:restartNumberingAfterBreak="0">
     <w:nsid w:val="5AE26067"/>
     <w:multiLevelType w:val="multilevel"/>
     <w:tmpl w:val="553416B8"/>
@@ -2062,7 +2519,7 @@
       </w:rPr>
     </w:lvl>
   </w:abstractNum>
-  <w:abstractNum w:abstractNumId="11" w15:restartNumberingAfterBreak="0">
+  <w:abstractNum w:abstractNumId="12" w15:restartNumberingAfterBreak="0">
     <w:nsid w:val="5B632D14"/>
     <w:multiLevelType w:val="multilevel"/>
     <w:tmpl w:val="3F5CF860"/>
@@ -2211,7 +2668,156 @@
       </w:rPr>
     </w:lvl>
   </w:abstractNum>
-  <w:abstractNum w:abstractNumId="12" w15:restartNumberingAfterBreak="0">
+  <w:abstractNum w:abstractNumId="13" w15:restartNumberingAfterBreak="0">
+    <w:nsid w:val="6325523F"/>
+    <w:multiLevelType w:val="multilevel"/>
+    <w:tmpl w:val="F03E3780"/>
+    <w:lvl w:ilvl="0">
+      <w:start w:val="1"/>
+      <w:numFmt w:val="bullet"/>
+      <w:lvlText w:val=""/>
+      <w:lvlJc w:val="left"/>
+      <w:pPr>
+        <w:tabs>
+          <w:tab w:val="num" w:pos="720"/>
+        </w:tabs>
+        <w:ind w:left="720" w:hanging="360"/>
+      </w:pPr>
+      <w:rPr>
+        <w:rFonts w:ascii="Symbol" w:hAnsi="Symbol" w:hint="default"/>
+        <w:sz w:val="20"/>
+      </w:rPr>
+    </w:lvl>
+    <w:lvl w:ilvl="1" w:tentative="1">
+      <w:start w:val="1"/>
+      <w:numFmt w:val="bullet"/>
+      <w:lvlText w:val="o"/>
+      <w:lvlJc w:val="left"/>
+      <w:pPr>
+        <w:tabs>
+          <w:tab w:val="num" w:pos="1440"/>
+        </w:tabs>
+        <w:ind w:left="1440" w:hanging="360"/>
+      </w:pPr>
+      <w:rPr>
+        <w:rFonts w:ascii="Courier New" w:hAnsi="Courier New" w:hint="default"/>
+        <w:sz w:val="20"/>
+      </w:rPr>
+    </w:lvl>
+    <w:lvl w:ilvl="2" w:tentative="1">
+      <w:start w:val="1"/>
+      <w:numFmt w:val="bullet"/>
+      <w:lvlText w:val=""/>
+      <w:lvlJc w:val="left"/>
+      <w:pPr>
+        <w:tabs>
+          <w:tab w:val="num" w:pos="2160"/>
+        </w:tabs>
+        <w:ind w:left="2160" w:hanging="360"/>
+      </w:pPr>
+      <w:rPr>
+        <w:rFonts w:ascii="Wingdings" w:hAnsi="Wingdings" w:hint="default"/>
+        <w:sz w:val="20"/>
+      </w:rPr>
+    </w:lvl>
+    <w:lvl w:ilvl="3" w:tentative="1">
+      <w:start w:val="1"/>
+      <w:numFmt w:val="bullet"/>
+      <w:lvlText w:val=""/>
+      <w:lvlJc w:val="left"/>
+      <w:pPr>
+        <w:tabs>
+          <w:tab w:val="num" w:pos="2880"/>
+        </w:tabs>
+        <w:ind w:left="2880" w:hanging="360"/>
+      </w:pPr>
+      <w:rPr>
+        <w:rFonts w:ascii="Wingdings" w:hAnsi="Wingdings" w:hint="default"/>
+        <w:sz w:val="20"/>
+      </w:rPr>
+    </w:lvl>
+    <w:lvl w:ilvl="4" w:tentative="1">
+      <w:start w:val="1"/>
+      <w:numFmt w:val="bullet"/>
+      <w:lvlText w:val=""/>
+      <w:lvlJc w:val="left"/>
+      <w:pPr>
+        <w:tabs>
+          <w:tab w:val="num" w:pos="3600"/>
+        </w:tabs>
+        <w:ind w:left="3600" w:hanging="360"/>
+      </w:pPr>
+      <w:rPr>
+        <w:rFonts w:ascii="Wingdings" w:hAnsi="Wingdings" w:hint="default"/>
+        <w:sz w:val="20"/>
+      </w:rPr>
+    </w:lvl>
+    <w:lvl w:ilvl="5" w:tentative="1">
+      <w:start w:val="1"/>
+      <w:numFmt w:val="bullet"/>
+      <w:lvlText w:val=""/>
+      <w:lvlJc w:val="left"/>
+      <w:pPr>
+        <w:tabs>
+          <w:tab w:val="num" w:pos="4320"/>
+        </w:tabs>
+        <w:ind w:left="4320" w:hanging="360"/>
+      </w:pPr>
+      <w:rPr>
+        <w:rFonts w:ascii="Wingdings" w:hAnsi="Wingdings" w:hint="default"/>
+        <w:sz w:val="20"/>
+      </w:rPr>
+    </w:lvl>
+    <w:lvl w:ilvl="6" w:tentative="1">
+      <w:start w:val="1"/>
+      <w:numFmt w:val="bullet"/>
+      <w:lvlText w:val=""/>
+      <w:lvlJc w:val="left"/>
+      <w:pPr>
+        <w:tabs>
+          <w:tab w:val="num" w:pos="5040"/>
+        </w:tabs>
+        <w:ind w:left="5040" w:hanging="360"/>
+      </w:pPr>
+      <w:rPr>
+        <w:rFonts w:ascii="Wingdings" w:hAnsi="Wingdings" w:hint="default"/>
+        <w:sz w:val="20"/>
+      </w:rPr>
+    </w:lvl>
+    <w:lvl w:ilvl="7" w:tentative="1">
+      <w:start w:val="1"/>
+      <w:numFmt w:val="bullet"/>
+      <w:lvlText w:val=""/>
+      <w:lvlJc w:val="left"/>
+      <w:pPr>
+        <w:tabs>
+          <w:tab w:val="num" w:pos="5760"/>
+        </w:tabs>
+        <w:ind w:left="5760" w:hanging="360"/>
+      </w:pPr>
+      <w:rPr>
+        <w:rFonts w:ascii="Wingdings" w:hAnsi="Wingdings" w:hint="default"/>
+        <w:sz w:val="20"/>
+      </w:rPr>
+    </w:lvl>
+    <w:lvl w:ilvl="8" w:tentative="1">
+      <w:start w:val="1"/>
+      <w:numFmt w:val="bullet"/>
+      <w:lvlText w:val=""/>
+      <w:lvlJc w:val="left"/>
+      <w:pPr>
+        <w:tabs>
+          <w:tab w:val="num" w:pos="6480"/>
+        </w:tabs>
+        <w:ind w:left="6480" w:hanging="360"/>
+      </w:pPr>
+      <w:rPr>
+        <w:rFonts w:ascii="Wingdings" w:hAnsi="Wingdings" w:hint="default"/>
+        <w:sz w:val="20"/>
+      </w:rPr>
+    </w:lvl>
+  </w:abstractNum>
+  <w:abstractNum w:abstractNumId="14" w15:restartNumberingAfterBreak="0">
     <w:nsid w:val="64B66688"/>
     <w:multiLevelType w:val="multilevel"/>
     <w:tmpl w:val="76D8B63C"/>
@@ -2360,7 +2966,7 @@
       </w:rPr>
     </w:lvl>
   </w:abstractNum>
-  <w:abstractNum w:abstractNumId="13" w15:restartNumberingAfterBreak="0">
+  <w:abstractNum w:abstractNumId="15" w15:restartNumberingAfterBreak="0">
     <w:nsid w:val="6B9D39E5"/>
     <w:multiLevelType w:val="multilevel"/>
     <w:tmpl w:val="6B2AB0C2"/>
@@ -2509,7 +3115,7 @@
       </w:rPr>
     </w:lvl>
   </w:abstractNum>
-  <w:abstractNum w:abstractNumId="14" w15:restartNumberingAfterBreak="0">
+  <w:abstractNum w:abstractNumId="16" w15:restartNumberingAfterBreak="0">
     <w:nsid w:val="6FD7689F"/>
     <w:multiLevelType w:val="multilevel"/>
     <w:tmpl w:val="EB247ED6"/>
@@ -2658,7 +3264,7 @@
       </w:rPr>
     </w:lvl>
   </w:abstractNum>
-  <w:abstractNum w:abstractNumId="15" w15:restartNumberingAfterBreak="0">
+  <w:abstractNum w:abstractNumId="17" w15:restartNumberingAfterBreak="0">
     <w:nsid w:val="7058392A"/>
     <w:multiLevelType w:val="hybridMultilevel"/>
     <w:tmpl w:val="6AA46ED0"/>
@@ -2771,7 +3377,7 @@
       </w:rPr>
     </w:lvl>
   </w:abstractNum>
-  <w:abstractNum w:abstractNumId="16" w15:restartNumberingAfterBreak="0">
+  <w:abstractNum w:abstractNumId="18" w15:restartNumberingAfterBreak="0">
     <w:nsid w:val="778A4A5C"/>
     <w:multiLevelType w:val="multilevel"/>
     <w:tmpl w:val="D08407D2"/>
@@ -2921,55 +3527,61 @@
     </w:lvl>
   </w:abstractNum>
   <w:num w:numId="1" w16cid:durableId="1514953135">
-    <w:abstractNumId w:val="3"/>
+    <w:abstractNumId w:val="4"/>
   </w:num>
   <w:num w:numId="2" w16cid:durableId="604967705">
+    <w:abstractNumId w:val="9"/>
+  </w:num>
+  <w:num w:numId="3" w16cid:durableId="1162816915">
+    <w:abstractNumId w:val="14"/>
+  </w:num>
+  <w:num w:numId="4" w16cid:durableId="2124574516">
+    <w:abstractNumId w:val="2"/>
+  </w:num>
+  <w:num w:numId="5" w16cid:durableId="635991339">
+    <w:abstractNumId w:val="18"/>
+  </w:num>
+  <w:num w:numId="6" w16cid:durableId="315768525">
     <w:abstractNumId w:val="8"/>
   </w:num>
-  <w:num w:numId="3" w16cid:durableId="1162816915">
-    <w:abstractNumId w:val="12"/>
-  </w:num>
-  <w:num w:numId="4" w16cid:durableId="2124574516">
-    <w:abstractNumId w:val="1"/>
-  </w:num>
-  <w:num w:numId="5" w16cid:durableId="635991339">
+  <w:num w:numId="7" w16cid:durableId="784009397">
     <w:abstractNumId w:val="16"/>
-  </w:num>
-  <w:num w:numId="6" w16cid:durableId="315768525">
-    <w:abstractNumId w:val="7"/>
-  </w:num>
-  <w:num w:numId="7" w16cid:durableId="784009397">
-    <w:abstractNumId w:val="14"/>
   </w:num>
   <w:num w:numId="8" w16cid:durableId="240992803">
     <w:abstractNumId w:val="0"/>
   </w:num>
   <w:num w:numId="9" w16cid:durableId="414592637">
-    <w:abstractNumId w:val="2"/>
+    <w:abstractNumId w:val="3"/>
   </w:num>
   <w:num w:numId="10" w16cid:durableId="978267854">
+    <w:abstractNumId w:val="7"/>
+  </w:num>
+  <w:num w:numId="11" w16cid:durableId="1469860492">
+    <w:abstractNumId w:val="15"/>
+  </w:num>
+  <w:num w:numId="12" w16cid:durableId="614678979">
+    <w:abstractNumId w:val="11"/>
+  </w:num>
+  <w:num w:numId="13" w16cid:durableId="1068530323">
     <w:abstractNumId w:val="6"/>
   </w:num>
-  <w:num w:numId="11" w16cid:durableId="1469860492">
-    <w:abstractNumId w:val="13"/>
-  </w:num>
-  <w:num w:numId="12" w16cid:durableId="614678979">
+  <w:num w:numId="14" w16cid:durableId="1422795441">
     <w:abstractNumId w:val="10"/>
   </w:num>
-  <w:num w:numId="13" w16cid:durableId="1068530323">
+  <w:num w:numId="15" w16cid:durableId="1618095521">
     <w:abstractNumId w:val="5"/>
   </w:num>
-  <w:num w:numId="14" w16cid:durableId="1422795441">
-    <w:abstractNumId w:val="9"/>
-  </w:num>
-  <w:num w:numId="15" w16cid:durableId="1618095521">
-    <w:abstractNumId w:val="4"/>
-  </w:num>
   <w:num w:numId="16" w16cid:durableId="217127456">
-    <w:abstractNumId w:val="11"/>
+    <w:abstractNumId w:val="12"/>
   </w:num>
   <w:num w:numId="17" w16cid:durableId="658001500">
-    <w:abstractNumId w:val="15"/>
+    <w:abstractNumId w:val="17"/>
+  </w:num>
+  <w:num w:numId="18" w16cid:durableId="2133549910">
+    <w:abstractNumId w:val="1"/>
+  </w:num>
+  <w:num w:numId="19" w16cid:durableId="974943472">
+    <w:abstractNumId w:val="13"/>
   </w:num>
 </w:numbering>
 </file>

</xml_diff>